<commit_message>
Actualizo el proyecto añadiendo el README en formato MD.
</commit_message>
<xml_diff>
--- a/README.docx
+++ b/README.docx
@@ -156,13 +156,7 @@
         <w:rPr>
           <w:rFonts w:ascii="Arial" w:hAnsi="Arial" w:cs="Arial"/>
         </w:rPr>
-        <w:t xml:space="preserve"> </w:t>
-      </w:r>
-      <w:r>
-        <w:rPr>
-          <w:rFonts w:ascii="Arial" w:hAnsi="Arial" w:cs="Arial"/>
-        </w:rPr>
-        <w:t>(Prioridad Alta)</w:t>
+        <w:t xml:space="preserve"> (Prioridad Alta)</w:t>
       </w:r>
     </w:p>
     <w:p>
@@ -202,13 +196,7 @@
         <w:rPr>
           <w:rFonts w:ascii="Arial" w:hAnsi="Arial" w:cs="Arial"/>
         </w:rPr>
-        <w:t xml:space="preserve"> </w:t>
-      </w:r>
-      <w:r>
-        <w:rPr>
-          <w:rFonts w:ascii="Arial" w:hAnsi="Arial" w:cs="Arial"/>
-        </w:rPr>
-        <w:t>(Resolver antes prioridad Alta)</w:t>
+        <w:t xml:space="preserve"> (Resolver antes prioridad Alta)</w:t>
       </w:r>
     </w:p>
     <w:p>
@@ -228,20 +216,13 @@
         <w:rPr>
           <w:rFonts w:ascii="Arial" w:hAnsi="Arial" w:cs="Arial"/>
         </w:rPr>
-        <w:t xml:space="preserve"> </w:t>
-      </w:r>
-      <w:r>
-        <w:rPr>
-          <w:rFonts w:ascii="Arial" w:hAnsi="Arial" w:cs="Arial"/>
-        </w:rPr>
-        <w:t>(Resolver antes prioridad Alta)</w:t>
-      </w:r>
-    </w:p>
-    <w:p>
-      <w:pPr>
-        <w:rPr>
-          <w:rFonts w:ascii="Arial" w:hAnsi="Arial" w:cs="Arial"/>
-          <w:lang w:val="ca-ES"/>
+        <w:t xml:space="preserve"> (Resolver antes prioridad Alta)</w:t>
+      </w:r>
+    </w:p>
+    <w:p>
+      <w:pPr>
+        <w:rPr>
+          <w:rFonts w:ascii="Arial" w:hAnsi="Arial" w:cs="Arial"/>
         </w:rPr>
       </w:pPr>
       <w:r>
@@ -255,14 +236,163 @@
         <w:rPr>
           <w:rFonts w:ascii="Arial" w:hAnsi="Arial" w:cs="Arial"/>
         </w:rPr>
-        <w:t xml:space="preserve"> </w:t>
-      </w:r>
-      <w:r>
-        <w:rPr>
-          <w:rFonts w:ascii="Arial" w:hAnsi="Arial" w:cs="Arial"/>
-        </w:rPr>
-        <w:t>(Resolver antes prioridad Alta)</w:t>
-      </w:r>
+        <w:t xml:space="preserve"> (Resolver antes prioridad Alta)</w:t>
+      </w:r>
+    </w:p>
+    <w:p>
+      <w:pPr>
+        <w:rPr>
+          <w:rFonts w:ascii="Arial" w:hAnsi="Arial" w:cs="Arial"/>
+        </w:rPr>
+      </w:pPr>
+    </w:p>
+    <w:p>
+      <w:pPr>
+        <w:rPr>
+          <w:rFonts w:ascii="Arial" w:hAnsi="Arial" w:cs="Arial"/>
+        </w:rPr>
+      </w:pPr>
+    </w:p>
+    <w:p>
+      <w:pPr>
+        <w:rPr>
+          <w:rFonts w:ascii="Arial" w:hAnsi="Arial" w:cs="Arial"/>
+        </w:rPr>
+      </w:pPr>
+    </w:p>
+    <w:p>
+      <w:pPr>
+        <w:pBdr>
+          <w:bottom w:val="single" w:sz="6" w:space="1" w:color="auto"/>
+        </w:pBdr>
+        <w:rPr>
+          <w:rFonts w:ascii="Arial" w:hAnsi="Arial" w:cs="Arial"/>
+        </w:rPr>
+      </w:pPr>
+    </w:p>
+    <w:p>
+      <w:pPr>
+        <w:rPr>
+          <w:rFonts w:ascii="Arial" w:hAnsi="Arial" w:cs="Arial"/>
+        </w:rPr>
+      </w:pPr>
+      <w:r>
+        <w:rPr>
+          <w:rFonts w:ascii="Arial" w:hAnsi="Arial" w:cs="Arial"/>
+        </w:rPr>
+        <w:t>Hablado con el profe 05/03/2026</w:t>
+      </w:r>
+    </w:p>
+    <w:p>
+      <w:pPr>
+        <w:rPr>
+          <w:rFonts w:ascii="Arial" w:hAnsi="Arial" w:cs="Arial"/>
+        </w:rPr>
+      </w:pPr>
+      <w:r>
+        <w:rPr>
+          <w:rFonts w:ascii="Arial" w:hAnsi="Arial" w:cs="Arial"/>
+        </w:rPr>
+        <w:t>-Pasar el formato a .</w:t>
+      </w:r>
+      <w:proofErr w:type="spellStart"/>
+      <w:r>
+        <w:rPr>
+          <w:rFonts w:ascii="Arial" w:hAnsi="Arial" w:cs="Arial"/>
+        </w:rPr>
+        <w:t>md</w:t>
+      </w:r>
+      <w:proofErr w:type="spellEnd"/>
+    </w:p>
+    <w:p>
+      <w:pPr>
+        <w:rPr>
+          <w:rFonts w:ascii="Arial" w:hAnsi="Arial" w:cs="Arial"/>
+        </w:rPr>
+      </w:pPr>
+      <w:r>
+        <w:rPr>
+          <w:rFonts w:ascii="Arial" w:hAnsi="Arial" w:cs="Arial"/>
+        </w:rPr>
+        <w:t xml:space="preserve">-Visualizar la tabla de dimensiones </w:t>
+      </w:r>
+      <w:proofErr w:type="spellStart"/>
+      <w:r>
+        <w:rPr>
+          <w:rFonts w:ascii="Arial" w:hAnsi="Arial" w:cs="Arial"/>
+        </w:rPr>
+        <w:t>mas</w:t>
+      </w:r>
+      <w:proofErr w:type="spellEnd"/>
+      <w:r>
+        <w:rPr>
+          <w:rFonts w:ascii="Arial" w:hAnsi="Arial" w:cs="Arial"/>
+        </w:rPr>
+        <w:t xml:space="preserve"> reducida sobre las dimensiones que me llevaran a mis </w:t>
+      </w:r>
+      <w:proofErr w:type="spellStart"/>
+      <w:r>
+        <w:rPr>
+          <w:rFonts w:ascii="Arial" w:hAnsi="Arial" w:cs="Arial"/>
+        </w:rPr>
+        <w:t>kpi</w:t>
+      </w:r>
+      <w:proofErr w:type="spellEnd"/>
+      <w:r>
+        <w:rPr>
+          <w:rFonts w:ascii="Arial" w:hAnsi="Arial" w:cs="Arial"/>
+        </w:rPr>
+        <w:t xml:space="preserve"> / evitar dolores de cabeza con tablas enormes.</w:t>
+      </w:r>
+    </w:p>
+    <w:p>
+      <w:pPr>
+        <w:rPr>
+          <w:rFonts w:ascii="Arial" w:hAnsi="Arial" w:cs="Arial"/>
+        </w:rPr>
+      </w:pPr>
+      <w:r>
+        <w:rPr>
+          <w:rFonts w:ascii="Arial" w:hAnsi="Arial" w:cs="Arial"/>
+        </w:rPr>
+        <w:t>-Separar en Excel varios archivos por cada tabla y luego cargarlas, es otro camino.</w:t>
+      </w:r>
+    </w:p>
+    <w:p>
+      <w:pPr>
+        <w:rPr>
+          <w:rFonts w:ascii="Arial" w:hAnsi="Arial" w:cs="Arial"/>
+        </w:rPr>
+      </w:pPr>
+      <w:r>
+        <w:rPr>
+          <w:rFonts w:ascii="Arial" w:hAnsi="Arial" w:cs="Arial"/>
+        </w:rPr>
+        <w:t>-Pasar transaccional/luego estrella/ dimensiones.</w:t>
+      </w:r>
+    </w:p>
+    <w:p>
+      <w:pPr>
+        <w:pBdr>
+          <w:bottom w:val="single" w:sz="6" w:space="1" w:color="auto"/>
+        </w:pBdr>
+        <w:rPr>
+          <w:rFonts w:ascii="Arial" w:hAnsi="Arial" w:cs="Arial"/>
+        </w:rPr>
+      </w:pPr>
+      <w:r>
+        <w:rPr>
+          <w:rFonts w:ascii="Arial" w:hAnsi="Arial" w:cs="Arial"/>
+        </w:rPr>
+        <w:t>-visualizar KPI para reducir las dimensiones a las que usaré.</w:t>
+      </w:r>
+    </w:p>
+    <w:p>
+      <w:pPr>
+        <w:rPr>
+          <w:rFonts w:ascii="Arial" w:hAnsi="Arial" w:cs="Arial"/>
+        </w:rPr>
+      </w:pPr>
     </w:p>
     <w:sectPr>
       <w:pgSz w:w="11906" w:h="16838"/>
@@ -674,6 +804,7 @@
   <w:style w:type="paragraph" w:default="1" w:styleId="Normal">
     <w:name w:val="Normal"/>
     <w:qFormat/>
+    <w:rsid w:val="00B70ECE"/>
   </w:style>
   <w:style w:type="paragraph" w:styleId="Ttulo1">
     <w:name w:val="heading 1"/>

</xml_diff>